<commit_message>
fix verified statement logic
</commit_message>
<xml_diff>
--- a/docassemble/MLHDivorceAndCustody/data/templates/instructions_divorce_with_children.docx
+++ b/docassemble/MLHDivorceAndCustody/data/templates/instructions_divorce_with_children.docx
@@ -2672,15 +2672,7 @@
           <w:bCs/>
           <w:color w:val="222222"/>
         </w:rPr>
-        <w:t>3</w:t>
-      </w:r>
-      <w:r>
-        <w:rPr>
-          <w:b/>
-          <w:bCs/>
-          <w:color w:val="222222"/>
-        </w:rPr>
-        <w:t xml:space="preserve"> </w:t>
+        <w:t xml:space="preserve">3 </w:t>
       </w:r>
       <w:proofErr w:type="gramStart"/>
       <w:r>
@@ -3396,7 +3388,21 @@
         <w:rPr>
           <w:color w:val="222222"/>
         </w:rPr>
-        <w:t xml:space="preserve"> does not get any of the other documents.{% else %}</w:t>
+        <w:t xml:space="preserve"> does not get any of the other </w:t>
+      </w:r>
+      <w:proofErr w:type="gramStart"/>
+      <w:r>
+        <w:rPr>
+          <w:color w:val="222222"/>
+        </w:rPr>
+        <w:t>documents.{</w:t>
+      </w:r>
+      <w:proofErr w:type="gramEnd"/>
+      <w:r>
+        <w:rPr>
+          <w:color w:val="222222"/>
+        </w:rPr>
+        <w:t>% else %}</w:t>
       </w:r>
       <w:r>
         <w:rPr>
@@ -3405,10 +3411,15 @@
         <w:t xml:space="preserve"> </w:t>
       </w:r>
       <w:r>
-        <w:t>(if needed)</w:t>
-      </w:r>
-      <w:r>
-        <w:t xml:space="preserve">. </w:t>
+        <w:t xml:space="preserve">(if </w:t>
+      </w:r>
+      <w:proofErr w:type="gramStart"/>
+      <w:r>
+        <w:t>needed).</w:t>
+      </w:r>
+      <w:proofErr w:type="gramEnd"/>
+      <w:r>
+        <w:t xml:space="preserve"> </w:t>
       </w:r>
       <w:r>
         <w:rPr>
@@ -5438,53 +5449,6 @@
     </w:p>
     <w:p>
       <w:pPr>
-        <w:pStyle w:val="Normal1"/>
-        <w:numPr>
-          <w:ilvl w:val="0"/>
-          <w:numId w:val="3"/>
-        </w:numPr>
-        <w:shd w:val="clear" w:color="auto" w:fill="FFFFFF"/>
-        <w:rPr>
-          <w:rFonts w:asciiTheme="minorHAnsi" w:hAnsiTheme="minorHAnsi" w:cstheme="minorHAnsi"/>
-          <w:color w:val="000000"/>
-          <w:sz w:val="22"/>
-          <w:szCs w:val="22"/>
-        </w:rPr>
-      </w:pPr>
-      <w:r>
-        <w:rPr>
-          <w:rFonts w:asciiTheme="minorHAnsi" w:hAnsiTheme="minorHAnsi" w:cstheme="minorHAnsi"/>
-          <w:color w:val="000000"/>
-          <w:sz w:val="22"/>
-          <w:szCs w:val="22"/>
-          <w:shd w:val="clear" w:color="auto" w:fill="CCFFCC"/>
-        </w:rPr>
-        <w:t>Verified Statement</w:t>
-      </w:r>
-      <w:r>
-        <w:rPr>
-          <w:rStyle w:val="Strong"/>
-          <w:rFonts w:asciiTheme="minorHAnsi" w:hAnsiTheme="minorHAnsi" w:cstheme="minorHAnsi"/>
-          <w:color w:val="000000"/>
-          <w:sz w:val="22"/>
-          <w:szCs w:val="22"/>
-          <w:shd w:val="clear" w:color="auto" w:fill="CCFFCC"/>
-        </w:rPr>
-        <w:t>*</w:t>
-      </w:r>
-      <w:r>
-        <w:rPr>
-          <w:rFonts w:asciiTheme="minorHAnsi" w:hAnsiTheme="minorHAnsi" w:cstheme="minorHAnsi"/>
-          <w:color w:val="000000"/>
-          <w:sz w:val="22"/>
-          <w:szCs w:val="22"/>
-          <w:shd w:val="clear" w:color="auto" w:fill="CCFFCC"/>
-        </w:rPr>
-        <w:t> (You may need to submit this form differently. Learn more below.)</w:t>
-      </w:r>
-    </w:p>
-    <w:p>
-      <w:pPr>
         <w:numPr>
           <w:ilvl w:val="0"/>
           <w:numId w:val="3"/>
@@ -5492,15 +5456,32 @@
         <w:spacing w:after="0"/>
       </w:pPr>
       <w:r>
-        <w:rPr>
-          <w:color w:val="222222"/>
-        </w:rPr>
-        <w:t xml:space="preserve">{%p if </w:t>
+        <w:t xml:space="preserve">Verified </w:t>
+      </w:r>
+      <w:proofErr w:type="gramStart"/>
+      <w:r>
+        <w:t>Statement</w:t>
+      </w:r>
+      <w:r>
+        <w:rPr>
+          <w:color w:val="222222"/>
+          <w:highlight w:val="white"/>
+        </w:rPr>
+        <w:t>{</w:t>
+      </w:r>
+      <w:proofErr w:type="gramEnd"/>
+      <w:r>
+        <w:rPr>
+          <w:color w:val="222222"/>
+          <w:highlight w:val="white"/>
+        </w:rPr>
+        <w:t xml:space="preserve">% if </w:t>
       </w:r>
       <w:proofErr w:type="spellStart"/>
       <w:r>
         <w:rPr>
           <w:color w:val="222222"/>
+          <w:highlight w:val="white"/>
         </w:rPr>
         <w:t>county_choice</w:t>
       </w:r>
@@ -5508,9 +5489,85 @@
       <w:r>
         <w:rPr>
           <w:color w:val="222222"/>
-        </w:rPr>
-        <w:t xml:space="preserve"> == “Ingham” %}</w:t>
-      </w:r>
+          <w:highlight w:val="white"/>
+        </w:rPr>
+        <w:t xml:space="preserve"> </w:t>
+      </w:r>
+      <w:r>
+        <w:rPr>
+          <w:color w:val="222222"/>
+          <w:highlight w:val="white"/>
+        </w:rPr>
+        <w:t xml:space="preserve">not </w:t>
+      </w:r>
+      <w:r>
+        <w:rPr>
+          <w:color w:val="222222"/>
+          <w:highlight w:val="white"/>
+        </w:rPr>
+        <w:t>in “</w:t>
+      </w:r>
+      <w:proofErr w:type="spellStart"/>
+      <w:r>
+        <w:rPr>
+          <w:color w:val="222222"/>
+          <w:highlight w:val="white"/>
+        </w:rPr>
+        <w:t>Allegan|Ingham|Lenawee|</w:t>
+      </w:r>
+      <w:r>
+        <w:rPr>
+          <w:color w:val="222222"/>
+          <w:highlight w:val="white"/>
+        </w:rPr>
+        <w:t>Oakland</w:t>
+      </w:r>
+      <w:r>
+        <w:rPr>
+          <w:color w:val="222222"/>
+          <w:highlight w:val="white"/>
+        </w:rPr>
+        <w:t>|Ottawa</w:t>
+      </w:r>
+      <w:proofErr w:type="spellEnd"/>
+      <w:r>
+        <w:rPr>
+          <w:color w:val="222222"/>
+          <w:highlight w:val="white"/>
+        </w:rPr>
+        <w:t xml:space="preserve">” </w:t>
+      </w:r>
+      <w:proofErr w:type="gramStart"/>
+      <w:r>
+        <w:rPr>
+          <w:color w:val="222222"/>
+          <w:highlight w:val="white"/>
+        </w:rPr>
+        <w:t>%}</w:t>
+      </w:r>
+      <w:r>
+        <w:t>*</w:t>
+      </w:r>
+      <w:proofErr w:type="gramEnd"/>
+      <w:r>
+        <w:t> (You may need to submit this form differently. Learn more below</w:t>
+      </w:r>
+      <w:proofErr w:type="gramStart"/>
+      <w:r>
+        <w:t>.)</w:t>
+      </w:r>
+      <w:r>
+        <w:t>{</w:t>
+      </w:r>
+      <w:proofErr w:type="gramEnd"/>
+      <w:r>
+        <w:t xml:space="preserve">% </w:t>
+      </w:r>
+      <w:proofErr w:type="gramStart"/>
+      <w:r>
+        <w:t>endif %}</w:t>
+      </w:r>
+      <w:proofErr w:type="gramEnd"/>
     </w:p>
     <w:p>
       <w:pPr>
@@ -5524,7 +5581,21 @@
         <w:rPr>
           <w:color w:val="222222"/>
         </w:rPr>
-        <w:t>Party Information Form (The clerk will give you this to complete. This form is for the court’s use only.)</w:t>
+        <w:t xml:space="preserve">{%p if </w:t>
+      </w:r>
+      <w:proofErr w:type="spellStart"/>
+      <w:r>
+        <w:rPr>
+          <w:color w:val="222222"/>
+        </w:rPr>
+        <w:t>county_choice</w:t>
+      </w:r>
+      <w:proofErr w:type="spellEnd"/>
+      <w:r>
+        <w:rPr>
+          <w:color w:val="222222"/>
+        </w:rPr>
+        <w:t xml:space="preserve"> == “Ingham” %}</w:t>
       </w:r>
     </w:p>
     <w:p>
@@ -5539,16 +5610,8 @@
         <w:rPr>
           <w:color w:val="222222"/>
         </w:rPr>
-        <w:t xml:space="preserve">{%p </w:t>
-      </w:r>
-      <w:proofErr w:type="gramStart"/>
-      <w:r>
-        <w:rPr>
-          <w:color w:val="222222"/>
-        </w:rPr>
-        <w:t>endif %}</w:t>
-      </w:r>
-      <w:proofErr w:type="gramEnd"/>
+        <w:t>Party Information Form (The clerk will give you this to complete. This form is for the court’s use only.)</w:t>
+      </w:r>
     </w:p>
     <w:p>
       <w:pPr>
@@ -5562,22 +5625,16 @@
         <w:rPr>
           <w:color w:val="222222"/>
         </w:rPr>
-        <w:t xml:space="preserve">{%p if </w:t>
-      </w:r>
-      <w:proofErr w:type="spellStart"/>
-      <w:r>
-        <w:rPr>
-          <w:color w:val="222222"/>
-        </w:rPr>
-        <w:t>county_choice</w:t>
-      </w:r>
-      <w:proofErr w:type="spellEnd"/>
-      <w:r>
-        <w:rPr>
-          <w:color w:val="222222"/>
-        </w:rPr>
-        <w:t xml:space="preserve"> == “Oscoda” %}</w:t>
-      </w:r>
+        <w:t xml:space="preserve">{%p </w:t>
+      </w:r>
+      <w:proofErr w:type="gramStart"/>
+      <w:r>
+        <w:rPr>
+          <w:color w:val="222222"/>
+        </w:rPr>
+        <w:t>endif %}</w:t>
+      </w:r>
+      <w:proofErr w:type="gramEnd"/>
     </w:p>
     <w:p>
       <w:pPr>
@@ -5591,6 +5648,35 @@
         <w:rPr>
           <w:color w:val="222222"/>
         </w:rPr>
+        <w:t xml:space="preserve">{%p if </w:t>
+      </w:r>
+      <w:proofErr w:type="spellStart"/>
+      <w:r>
+        <w:rPr>
+          <w:color w:val="222222"/>
+        </w:rPr>
+        <w:t>county_choice</w:t>
+      </w:r>
+      <w:proofErr w:type="spellEnd"/>
+      <w:r>
+        <w:rPr>
+          <w:color w:val="222222"/>
+        </w:rPr>
+        <w:t xml:space="preserve"> == “Oscoda” %}</w:t>
+      </w:r>
+    </w:p>
+    <w:p>
+      <w:pPr>
+        <w:numPr>
+          <w:ilvl w:val="0"/>
+          <w:numId w:val="3"/>
+        </w:numPr>
+        <w:spacing w:after="0"/>
+      </w:pPr>
+      <w:r>
+        <w:rPr>
+          <w:color w:val="222222"/>
+        </w:rPr>
         <w:t>Proof of Service</w:t>
       </w:r>
       <w:r>
@@ -6054,11 +6140,86 @@
       </w:pPr>
       <w:r>
         <w:rPr>
+          <w:color w:val="222222"/>
+          <w:highlight w:val="white"/>
+        </w:rPr>
+        <w:lastRenderedPageBreak/>
+        <w:t>{</w:t>
+      </w:r>
+      <w:r>
+        <w:rPr>
+          <w:color w:val="222222"/>
+          <w:highlight w:val="white"/>
+        </w:rPr>
+        <w:t>p</w:t>
+      </w:r>
+      <w:r>
+        <w:rPr>
+          <w:color w:val="222222"/>
+          <w:highlight w:val="white"/>
+        </w:rPr>
+        <w:t xml:space="preserve">% if </w:t>
+      </w:r>
+      <w:proofErr w:type="spellStart"/>
+      <w:r>
+        <w:rPr>
+          <w:color w:val="222222"/>
+          <w:highlight w:val="white"/>
+        </w:rPr>
+        <w:t>county_choice</w:t>
+      </w:r>
+      <w:proofErr w:type="spellEnd"/>
+      <w:r>
+        <w:rPr>
+          <w:color w:val="222222"/>
+          <w:highlight w:val="white"/>
+        </w:rPr>
+        <w:t xml:space="preserve"> not in “</w:t>
+      </w:r>
+      <w:proofErr w:type="spellStart"/>
+      <w:r>
+        <w:rPr>
+          <w:color w:val="222222"/>
+          <w:highlight w:val="white"/>
+        </w:rPr>
+        <w:t>Allegan|Ingham|Lenawee|</w:t>
+      </w:r>
+      <w:r>
+        <w:rPr>
+          <w:color w:val="222222"/>
+          <w:highlight w:val="white"/>
+        </w:rPr>
+        <w:t>Oakland</w:t>
+      </w:r>
+      <w:r>
+        <w:rPr>
+          <w:color w:val="222222"/>
+          <w:highlight w:val="white"/>
+        </w:rPr>
+        <w:t>|Ottawa</w:t>
+      </w:r>
+      <w:proofErr w:type="spellEnd"/>
+      <w:r>
+        <w:rPr>
+          <w:color w:val="222222"/>
+          <w:highlight w:val="white"/>
+        </w:rPr>
+        <w:t>” %}</w:t>
+      </w:r>
+    </w:p>
+    <w:p>
+      <w:pPr>
+        <w:spacing w:before="180" w:after="180"/>
+        <w:rPr>
+          <w:color w:val="222222"/>
+        </w:rPr>
+      </w:pPr>
+      <w:r>
+        <w:rPr>
           <w:b/>
           <w:bCs/>
           <w:color w:val="222222"/>
         </w:rPr>
-        <w:lastRenderedPageBreak/>
         <w:t>*Verified Statement: </w:t>
       </w:r>
       <w:r>
@@ -6091,6 +6252,28 @@
         </w:rPr>
         <w:t>s office, and the clerk will separate it from the other filings and send it to the FOC. Other courts may want you to provide the Verified Statement to the FOC instead.</w:t>
       </w:r>
+    </w:p>
+    <w:p>
+      <w:pPr>
+        <w:spacing w:before="180" w:after="180"/>
+        <w:rPr>
+          <w:color w:val="222222"/>
+        </w:rPr>
+      </w:pPr>
+      <w:r>
+        <w:rPr>
+          <w:color w:val="222222"/>
+        </w:rPr>
+        <w:t xml:space="preserve">{%p </w:t>
+      </w:r>
+      <w:proofErr w:type="gramStart"/>
+      <w:r>
+        <w:rPr>
+          <w:color w:val="222222"/>
+        </w:rPr>
+        <w:t>endif %}</w:t>
+      </w:r>
+      <w:proofErr w:type="gramEnd"/>
     </w:p>
     <w:p>
       <w:pPr>
@@ -6733,6 +6916,7 @@
         <w:rPr>
           <w:color w:val="222222"/>
         </w:rPr>
+        <w:lastRenderedPageBreak/>
         <w:t xml:space="preserve">Friend of the Court Handbook.  (Print a copy of this </w:t>
       </w:r>
       <w:hyperlink r:id="rId41" w:history="1">
@@ -6781,7 +6965,6 @@
           <w:color w:val="222222"/>
           <w:highlight w:val="white"/>
         </w:rPr>
-        <w:lastRenderedPageBreak/>
         <w:t>{%p</w:t>
       </w:r>
       <w:r>

</xml_diff>

<commit_message>
add specific Oakland step 4 DO and DM; fix missing text; adjust step 5 list order
</commit_message>
<xml_diff>
--- a/docassemble/MLHDivorceAndCustody/data/templates/instructions_divorce_with_children.docx
+++ b/docassemble/MLHDivorceAndCustody/data/templates/instructions_divorce_with_children.docx
@@ -2463,11 +2463,186 @@
         </w:rPr>
         <w:t xml:space="preserve">{%p </w:t>
       </w:r>
+      <w:proofErr w:type="spellStart"/>
+      <w:r>
+        <w:rPr>
+          <w:color w:val="222222"/>
+        </w:rPr>
+        <w:t>elif</w:t>
+      </w:r>
+      <w:proofErr w:type="spellEnd"/>
+      <w:r>
+        <w:rPr>
+          <w:color w:val="222222"/>
+        </w:rPr>
+        <w:t xml:space="preserve"> </w:t>
+      </w:r>
+      <w:proofErr w:type="spellStart"/>
+      <w:r>
+        <w:rPr>
+          <w:color w:val="222222"/>
+        </w:rPr>
+        <w:t>county_choice</w:t>
+      </w:r>
+      <w:proofErr w:type="spellEnd"/>
+      <w:r>
+        <w:rPr>
+          <w:color w:val="222222"/>
+        </w:rPr>
+        <w:t xml:space="preserve"> == “Oakland” %} </w:t>
+      </w:r>
+    </w:p>
+    <w:p>
+      <w:pPr>
+        <w:spacing w:before="180" w:after="180"/>
+        <w:rPr>
+          <w:color w:val="222222"/>
+        </w:rPr>
+      </w:pPr>
+      <w:r>
+        <w:rPr>
+          <w:color w:val="222222"/>
+        </w:rPr>
+        <w:t>Make one extra copy of each of the following:</w:t>
+      </w:r>
+    </w:p>
+    <w:p>
+      <w:pPr>
+        <w:numPr>
+          <w:ilvl w:val="0"/>
+          <w:numId w:val="11"/>
+        </w:numPr>
+        <w:spacing w:before="180" w:after="0"/>
+      </w:pPr>
+      <w:r>
+        <w:rPr>
+          <w:color w:val="222222"/>
+        </w:rPr>
+        <w:t>Fee Waiver Request (if needed)</w:t>
+      </w:r>
+    </w:p>
+    <w:p>
+      <w:pPr>
+        <w:numPr>
+          <w:ilvl w:val="0"/>
+          <w:numId w:val="11"/>
+        </w:numPr>
+        <w:spacing w:after="0"/>
+      </w:pPr>
+      <w:r>
+        <w:rPr>
+          <w:color w:val="222222"/>
+        </w:rPr>
+        <w:t>Summons</w:t>
+      </w:r>
+    </w:p>
+    <w:p>
+      <w:pPr>
+        <w:numPr>
+          <w:ilvl w:val="0"/>
+          <w:numId w:val="11"/>
+        </w:numPr>
+        <w:spacing w:after="0"/>
+      </w:pPr>
+      <w:r>
+        <w:rPr>
+          <w:color w:val="222222"/>
+        </w:rPr>
+        <w:lastRenderedPageBreak/>
+        <w:t xml:space="preserve">Complaint </w:t>
+      </w:r>
       <w:proofErr w:type="gramStart"/>
       <w:r>
         <w:rPr>
           <w:color w:val="222222"/>
         </w:rPr>
+        <w:t>for</w:t>
+      </w:r>
+      <w:proofErr w:type="gramEnd"/>
+      <w:r>
+        <w:rPr>
+          <w:color w:val="222222"/>
+        </w:rPr>
+        <w:t xml:space="preserve"> Divorce with Children</w:t>
+      </w:r>
+    </w:p>
+    <w:p>
+      <w:pPr>
+        <w:numPr>
+          <w:ilvl w:val="0"/>
+          <w:numId w:val="11"/>
+        </w:numPr>
+        <w:spacing w:after="0"/>
+      </w:pPr>
+      <w:r>
+        <w:rPr>
+          <w:color w:val="222222"/>
+        </w:rPr>
+        <w:t>Uniform Child Custody Jurisdiction Enforcement Act Affidavit</w:t>
+      </w:r>
+    </w:p>
+    <w:p>
+      <w:pPr>
+        <w:numPr>
+          <w:ilvl w:val="0"/>
+          <w:numId w:val="11"/>
+        </w:numPr>
+        <w:spacing w:after="0"/>
+      </w:pPr>
+      <w:r>
+        <w:rPr>
+          <w:color w:val="222222"/>
+        </w:rPr>
+        <w:t>Verified Statement</w:t>
+      </w:r>
+    </w:p>
+    <w:p>
+      <w:pPr>
+        <w:numPr>
+          <w:ilvl w:val="0"/>
+          <w:numId w:val="11"/>
+        </w:numPr>
+        <w:spacing w:after="0"/>
+      </w:pPr>
+      <w:r>
+        <w:rPr>
+          <w:color w:val="222222"/>
+        </w:rPr>
+        <w:t xml:space="preserve">Application for IV-D Child Support Services (form DHS-1201D) </w:t>
+      </w:r>
+    </w:p>
+    <w:p>
+      <w:pPr>
+        <w:spacing w:before="180" w:after="180"/>
+        <w:rPr>
+          <w:color w:val="222222"/>
+        </w:rPr>
+      </w:pPr>
+      <w:r>
+        <w:rPr>
+          <w:color w:val="222222"/>
+        </w:rPr>
+        <w:t>The copies will be for your spouse. (See Step 6.)</w:t>
+      </w:r>
+    </w:p>
+    <w:p>
+      <w:pPr>
+        <w:spacing w:before="180" w:after="180"/>
+        <w:rPr>
+          <w:color w:val="222222"/>
+        </w:rPr>
+      </w:pPr>
+      <w:r>
+        <w:rPr>
+          <w:color w:val="222222"/>
+        </w:rPr>
+        <w:t xml:space="preserve">{%p </w:t>
+      </w:r>
+      <w:proofErr w:type="gramStart"/>
+      <w:r>
+        <w:rPr>
+          <w:color w:val="222222"/>
+        </w:rPr>
         <w:t xml:space="preserve">else </w:t>
       </w:r>
       <w:r>
@@ -2477,6 +2652,42 @@
         <w:t>%}</w:t>
       </w:r>
       <w:proofErr w:type="gramEnd"/>
+      <w:r>
+        <w:rPr>
+          <w:color w:val="222222"/>
+        </w:rPr>
+        <w:t xml:space="preserve"> </w:t>
+      </w:r>
+      <w:r>
+        <w:rPr>
+          <w:color w:val="BFBFBF" w:themeColor="background1" w:themeShade="BF"/>
+        </w:rPr>
+        <w:t xml:space="preserve">// </w:t>
+      </w:r>
+      <w:r>
+        <w:rPr>
+          <w:color w:val="BFBFBF" w:themeColor="background1" w:themeShade="BF"/>
+        </w:rPr>
+        <w:t>all counties excep</w:t>
+      </w:r>
+      <w:r>
+        <w:rPr>
+          <w:color w:val="BFBFBF" w:themeColor="background1" w:themeShade="BF"/>
+        </w:rPr>
+        <w:t xml:space="preserve">t </w:t>
+      </w:r>
+      <w:r>
+        <w:rPr>
+          <w:color w:val="BFBFBF" w:themeColor="background1" w:themeShade="BF"/>
+        </w:rPr>
+        <w:t>Wayne</w:t>
+      </w:r>
+      <w:r>
+        <w:rPr>
+          <w:color w:val="BFBFBF" w:themeColor="background1" w:themeShade="BF"/>
+        </w:rPr>
+        <w:t xml:space="preserve"> and Oakland</w:t>
+      </w:r>
     </w:p>
     <w:p>
       <w:pPr>
@@ -2517,7 +2728,6 @@
         <w:rPr>
           <w:color w:val="222222"/>
         </w:rPr>
-        <w:lastRenderedPageBreak/>
         <w:t>After you sign your documents, make copies as follows: (In some counties the court clerk’s office will make the copies for you. You can call the clerk’s office ahead of time to ask whether you need to make your own copies.)</w:t>
       </w:r>
     </w:p>
@@ -2557,15 +2767,16 @@
           <w:bCs/>
           <w:color w:val="222222"/>
         </w:rPr>
-        <w:t xml:space="preserve"> - </w:t>
-      </w:r>
+        <w:t xml:space="preserve"> </w:t>
+      </w:r>
+      <w:proofErr w:type="gramStart"/>
       <w:r>
         <w:rPr>
           <w:b/>
           <w:bCs/>
           <w:color w:val="222222"/>
         </w:rPr>
-        <w:t xml:space="preserve"> </w:t>
+        <w:t xml:space="preserve">- </w:t>
       </w:r>
       <w:r>
         <w:rPr>
@@ -2573,7 +2784,24 @@
           <w:bCs/>
           <w:color w:val="222222"/>
         </w:rPr>
-        <w:t>Find out if you need Friend of the Court copies.</w:t>
+        <w:t xml:space="preserve"> </w:t>
+      </w:r>
+      <w:r>
+        <w:rPr>
+          <w:b/>
+          <w:bCs/>
+          <w:color w:val="222222"/>
+        </w:rPr>
+        <w:t>Find</w:t>
+      </w:r>
+      <w:proofErr w:type="gramEnd"/>
+      <w:r>
+        <w:rPr>
+          <w:b/>
+          <w:bCs/>
+          <w:color w:val="222222"/>
+        </w:rPr>
+        <w:t xml:space="preserve"> out if you need Friend of the Court copies.</w:t>
       </w:r>
       <w:r>
         <w:rPr>
@@ -3564,6 +3792,7 @@
         <w:rPr>
           <w:color w:val="222222"/>
         </w:rPr>
+        <w:lastRenderedPageBreak/>
         <w:t xml:space="preserve">{%p if </w:t>
       </w:r>
       <w:proofErr w:type="spellStart"/>
@@ -3643,7 +3872,37 @@
         <w:rPr>
           <w:color w:val="222222"/>
         </w:rPr>
-        <w:t xml:space="preserve"> // Wayne</w:t>
+        <w:t xml:space="preserve"> </w:t>
+      </w:r>
+      <w:r>
+        <w:rPr>
+          <w:color w:val="BFBFBF" w:themeColor="background1" w:themeShade="BF"/>
+        </w:rPr>
+        <w:t>//</w:t>
+      </w:r>
+      <w:r>
+        <w:rPr>
+          <w:color w:val="BFBFBF" w:themeColor="background1" w:themeShade="BF"/>
+        </w:rPr>
+        <w:t xml:space="preserve"> </w:t>
+      </w:r>
+      <w:r>
+        <w:rPr>
+          <w:color w:val="BFBFBF" w:themeColor="background1" w:themeShade="BF"/>
+        </w:rPr>
+        <w:t xml:space="preserve">end </w:t>
+      </w:r>
+      <w:r>
+        <w:rPr>
+          <w:color w:val="BFBFBF" w:themeColor="background1" w:themeShade="BF"/>
+        </w:rPr>
+        <w:t>Wayne</w:t>
+      </w:r>
+      <w:r>
+        <w:rPr>
+          <w:color w:val="BFBFBF" w:themeColor="background1" w:themeShade="BF"/>
+        </w:rPr>
+        <w:t>/Oakland/other conditional</w:t>
       </w:r>
     </w:p>
     <w:p>
@@ -3651,7 +3910,6 @@
         <w:pStyle w:val="Heading3"/>
       </w:pPr>
       <w:r>
-        <w:lastRenderedPageBreak/>
         <w:t>Step 5: File your forms with filing fee</w:t>
       </w:r>
     </w:p>
@@ -4082,6 +4340,7 @@
         <w:rPr>
           <w:color w:val="222222"/>
         </w:rPr>
+        <w:lastRenderedPageBreak/>
         <w:t>In-person filings are accepted Monday and Thursday ONLY, 8:00 a.m. to 12:00 p.m. and 1:00 pm to 4:00 p.m.</w:t>
       </w:r>
     </w:p>
@@ -4170,7 +4429,6 @@
         <w:rPr>
           <w:color w:val="222222"/>
         </w:rPr>
-        <w:lastRenderedPageBreak/>
         <w:t xml:space="preserve">The clerk will stamp and file your Complaint for Divorce. You will get a case </w:t>
       </w:r>
       <w:proofErr w:type="gramStart"/>
@@ -4926,6 +5184,7 @@
           <w:color w:val="222222"/>
           <w:highlight w:val="white"/>
         </w:rPr>
+        <w:lastRenderedPageBreak/>
         <w:t xml:space="preserve">If you are filing in person or need contact information for the court, click on </w:t>
       </w:r>
       <w:hyperlink r:id="rId37">
@@ -4979,7 +5238,6 @@
         <w:rPr>
           <w:color w:val="222222"/>
         </w:rPr>
-        <w:lastRenderedPageBreak/>
         <w:t>It will cost you at least $</w:t>
       </w:r>
       <w:r>
@@ -5194,6 +5452,103 @@
       <w:r>
         <w:t>Jurisdiction Enforcement Act Affidavit</w:t>
       </w:r>
+    </w:p>
+    <w:p>
+      <w:pPr>
+        <w:numPr>
+          <w:ilvl w:val="0"/>
+          <w:numId w:val="3"/>
+        </w:numPr>
+        <w:spacing w:after="0"/>
+      </w:pPr>
+      <w:r>
+        <w:rPr>
+          <w:color w:val="222222"/>
+          <w:highlight w:val="white"/>
+        </w:rPr>
+        <w:t xml:space="preserve">{%p if </w:t>
+      </w:r>
+      <w:proofErr w:type="spellStart"/>
+      <w:r>
+        <w:rPr>
+          <w:color w:val="222222"/>
+          <w:highlight w:val="white"/>
+        </w:rPr>
+        <w:t>county_choice</w:t>
+      </w:r>
+      <w:proofErr w:type="spellEnd"/>
+      <w:r>
+        <w:rPr>
+          <w:color w:val="222222"/>
+          <w:highlight w:val="white"/>
+        </w:rPr>
+        <w:t xml:space="preserve"> in “</w:t>
+      </w:r>
+      <w:proofErr w:type="spellStart"/>
+      <w:r>
+        <w:rPr>
+          <w:color w:val="222222"/>
+          <w:highlight w:val="white"/>
+        </w:rPr>
+        <w:t>Allegan|Ingham|Lenawee|</w:t>
+      </w:r>
+      <w:r>
+        <w:rPr>
+          <w:color w:val="222222"/>
+          <w:highlight w:val="white"/>
+        </w:rPr>
+        <w:t>Oakland</w:t>
+      </w:r>
+      <w:r>
+        <w:rPr>
+          <w:color w:val="222222"/>
+          <w:highlight w:val="white"/>
+        </w:rPr>
+        <w:t>|Ottawa</w:t>
+      </w:r>
+      <w:proofErr w:type="spellEnd"/>
+      <w:r>
+        <w:rPr>
+          <w:color w:val="222222"/>
+          <w:highlight w:val="white"/>
+        </w:rPr>
+        <w:t>” %}</w:t>
+      </w:r>
+    </w:p>
+    <w:p>
+      <w:pPr>
+        <w:numPr>
+          <w:ilvl w:val="0"/>
+          <w:numId w:val="3"/>
+        </w:numPr>
+        <w:spacing w:after="0"/>
+      </w:pPr>
+      <w:r>
+        <w:t>Verified Statement</w:t>
+      </w:r>
+    </w:p>
+    <w:p>
+      <w:pPr>
+        <w:numPr>
+          <w:ilvl w:val="0"/>
+          <w:numId w:val="3"/>
+        </w:numPr>
+        <w:spacing w:after="0"/>
+      </w:pPr>
+      <w:r>
+        <w:rPr>
+          <w:color w:val="222222"/>
+        </w:rPr>
+        <w:t xml:space="preserve">{%p </w:t>
+      </w:r>
+      <w:proofErr w:type="gramStart"/>
+      <w:r>
+        <w:rPr>
+          <w:color w:val="222222"/>
+        </w:rPr>
+        <w:t>endif %}</w:t>
+      </w:r>
+      <w:proofErr w:type="gramEnd"/>
     </w:p>
     <w:p>
       <w:pPr>
@@ -5514,26 +5869,27 @@
         <w:spacing w:after="0"/>
       </w:pPr>
       <w:r>
-        <w:t xml:space="preserve">Verified </w:t>
-      </w:r>
-      <w:proofErr w:type="gramStart"/>
-      <w:r>
-        <w:t>Statement</w:t>
-      </w:r>
-      <w:r>
         <w:rPr>
           <w:color w:val="222222"/>
           <w:highlight w:val="white"/>
         </w:rPr>
-        <w:t>{</w:t>
-      </w:r>
-      <w:proofErr w:type="gramEnd"/>
+        <w:t xml:space="preserve">{%p if </w:t>
+      </w:r>
+      <w:proofErr w:type="spellStart"/>
       <w:r>
         <w:rPr>
           <w:color w:val="222222"/>
           <w:highlight w:val="white"/>
         </w:rPr>
-        <w:t xml:space="preserve">% if </w:t>
+        <w:t>county_choice</w:t>
+      </w:r>
+      <w:proofErr w:type="spellEnd"/>
+      <w:r>
+        <w:rPr>
+          <w:color w:val="222222"/>
+          <w:highlight w:val="white"/>
+        </w:rPr>
+        <w:t xml:space="preserve"> not in “</w:t>
       </w:r>
       <w:proofErr w:type="spellStart"/>
       <w:r>
@@ -5541,7 +5897,21 @@
           <w:color w:val="222222"/>
           <w:highlight w:val="white"/>
         </w:rPr>
-        <w:t>county_choice</w:t>
+        <w:t>Allegan|Ingham|Lenawee|</w:t>
+      </w:r>
+      <w:r>
+        <w:rPr>
+          <w:color w:val="222222"/>
+          <w:highlight w:val="white"/>
+        </w:rPr>
+        <w:t>Oakland</w:t>
+      </w:r>
+      <w:r>
+        <w:rPr>
+          <w:color w:val="222222"/>
+          <w:highlight w:val="white"/>
+        </w:rPr>
+        <w:t>|Ottawa</w:t>
       </w:r>
       <w:proofErr w:type="spellEnd"/>
       <w:r>
@@ -5549,69 +5919,8 @@
           <w:color w:val="222222"/>
           <w:highlight w:val="white"/>
         </w:rPr>
-        <w:t xml:space="preserve"> not in “</w:t>
-      </w:r>
-      <w:proofErr w:type="spellStart"/>
-      <w:r>
-        <w:rPr>
-          <w:color w:val="222222"/>
-          <w:highlight w:val="white"/>
-        </w:rPr>
-        <w:t>Allegan|Ingham|Lenawee|</w:t>
-      </w:r>
-      <w:r>
-        <w:rPr>
-          <w:color w:val="222222"/>
-          <w:highlight w:val="white"/>
-        </w:rPr>
-        <w:t>Oakland</w:t>
-      </w:r>
-      <w:r>
-        <w:rPr>
-          <w:color w:val="222222"/>
-          <w:highlight w:val="white"/>
-        </w:rPr>
-        <w:t>|Ottawa</w:t>
-      </w:r>
-      <w:proofErr w:type="spellEnd"/>
-      <w:r>
-        <w:rPr>
-          <w:color w:val="222222"/>
-          <w:highlight w:val="white"/>
-        </w:rPr>
-        <w:t xml:space="preserve">” </w:t>
-      </w:r>
-      <w:proofErr w:type="gramStart"/>
-      <w:r>
-        <w:rPr>
-          <w:color w:val="222222"/>
-          <w:highlight w:val="white"/>
-        </w:rPr>
-        <w:t>%}</w:t>
-      </w:r>
-      <w:r>
-        <w:t>*</w:t>
-      </w:r>
-      <w:proofErr w:type="gramEnd"/>
-      <w:r>
-        <w:t> (You may need to submit this form differently. Learn more below</w:t>
-      </w:r>
-      <w:proofErr w:type="gramStart"/>
-      <w:r>
-        <w:t>.)</w:t>
-      </w:r>
-      <w:r>
-        <w:t>{</w:t>
-      </w:r>
-      <w:proofErr w:type="gramEnd"/>
-      <w:r>
-        <w:t xml:space="preserve">% </w:t>
-      </w:r>
-      <w:proofErr w:type="gramStart"/>
-      <w:r>
-        <w:t>endif %}</w:t>
-      </w:r>
-      <w:proofErr w:type="gramEnd"/>
+        <w:t>” %}</w:t>
+      </w:r>
     </w:p>
     <w:p>
       <w:pPr>
@@ -5622,24 +5931,7 @@
         <w:spacing w:after="0"/>
       </w:pPr>
       <w:r>
-        <w:rPr>
-          <w:color w:val="222222"/>
-        </w:rPr>
-        <w:t xml:space="preserve">{%p if </w:t>
-      </w:r>
-      <w:proofErr w:type="spellStart"/>
-      <w:r>
-        <w:rPr>
-          <w:color w:val="222222"/>
-        </w:rPr>
-        <w:t>county_choice</w:t>
-      </w:r>
-      <w:proofErr w:type="spellEnd"/>
-      <w:r>
-        <w:rPr>
-          <w:color w:val="222222"/>
-        </w:rPr>
-        <w:t xml:space="preserve"> == “Ingham” %}</w:t>
+        <w:t>Verified Statement* (You may need to submit this form differently. Learn more below.)</w:t>
       </w:r>
     </w:p>
     <w:p>
@@ -5651,11 +5943,19 @@
         <w:spacing w:after="0"/>
       </w:pPr>
       <w:r>
-        <w:rPr>
-          <w:color w:val="222222"/>
-        </w:rPr>
-        <w:t>Party Information Form (The clerk will give you this to complete. This form is for the court’s use only.)</w:t>
-      </w:r>
+        <w:t>{%</w:t>
+      </w:r>
+      <w:r>
+        <w:t>p</w:t>
+      </w:r>
+      <w:r>
+        <w:t xml:space="preserve"> </w:t>
+      </w:r>
+      <w:proofErr w:type="gramStart"/>
+      <w:r>
+        <w:t>endif %}</w:t>
+      </w:r>
+      <w:proofErr w:type="gramEnd"/>
     </w:p>
     <w:p>
       <w:pPr>
@@ -5669,16 +5969,22 @@
         <w:rPr>
           <w:color w:val="222222"/>
         </w:rPr>
-        <w:t xml:space="preserve">{%p </w:t>
-      </w:r>
-      <w:proofErr w:type="gramStart"/>
-      <w:r>
-        <w:rPr>
-          <w:color w:val="222222"/>
-        </w:rPr>
-        <w:t>endif %}</w:t>
-      </w:r>
-      <w:proofErr w:type="gramEnd"/>
+        <w:t xml:space="preserve">{%p if </w:t>
+      </w:r>
+      <w:proofErr w:type="spellStart"/>
+      <w:r>
+        <w:rPr>
+          <w:color w:val="222222"/>
+        </w:rPr>
+        <w:t>county_choice</w:t>
+      </w:r>
+      <w:proofErr w:type="spellEnd"/>
+      <w:r>
+        <w:rPr>
+          <w:color w:val="222222"/>
+        </w:rPr>
+        <w:t xml:space="preserve"> == “Ingham” %}</w:t>
+      </w:r>
     </w:p>
     <w:p>
       <w:pPr>
@@ -5692,21 +5998,7 @@
         <w:rPr>
           <w:color w:val="222222"/>
         </w:rPr>
-        <w:t xml:space="preserve">{%p if </w:t>
-      </w:r>
-      <w:proofErr w:type="spellStart"/>
-      <w:r>
-        <w:rPr>
-          <w:color w:val="222222"/>
-        </w:rPr>
-        <w:t>county_choice</w:t>
-      </w:r>
-      <w:proofErr w:type="spellEnd"/>
-      <w:r>
-        <w:rPr>
-          <w:color w:val="222222"/>
-        </w:rPr>
-        <w:t xml:space="preserve"> == “Oscoda” %}</w:t>
+        <w:t>Party Information Form (The clerk will give you this to complete. This form is for the court’s use only.)</w:t>
       </w:r>
     </w:p>
     <w:p>
@@ -5721,6 +6013,58 @@
         <w:rPr>
           <w:color w:val="222222"/>
         </w:rPr>
+        <w:t xml:space="preserve">{%p </w:t>
+      </w:r>
+      <w:proofErr w:type="gramStart"/>
+      <w:r>
+        <w:rPr>
+          <w:color w:val="222222"/>
+        </w:rPr>
+        <w:t>endif %}</w:t>
+      </w:r>
+      <w:proofErr w:type="gramEnd"/>
+    </w:p>
+    <w:p>
+      <w:pPr>
+        <w:numPr>
+          <w:ilvl w:val="0"/>
+          <w:numId w:val="3"/>
+        </w:numPr>
+        <w:spacing w:after="0"/>
+      </w:pPr>
+      <w:r>
+        <w:rPr>
+          <w:color w:val="222222"/>
+        </w:rPr>
+        <w:t xml:space="preserve">{%p if </w:t>
+      </w:r>
+      <w:proofErr w:type="spellStart"/>
+      <w:r>
+        <w:rPr>
+          <w:color w:val="222222"/>
+        </w:rPr>
+        <w:t>county_choice</w:t>
+      </w:r>
+      <w:proofErr w:type="spellEnd"/>
+      <w:r>
+        <w:rPr>
+          <w:color w:val="222222"/>
+        </w:rPr>
+        <w:t xml:space="preserve"> == “Oscoda” %}</w:t>
+      </w:r>
+    </w:p>
+    <w:p>
+      <w:pPr>
+        <w:numPr>
+          <w:ilvl w:val="0"/>
+          <w:numId w:val="3"/>
+        </w:numPr>
+        <w:spacing w:after="0"/>
+      </w:pPr>
+      <w:r>
+        <w:rPr>
+          <w:color w:val="222222"/>
+        </w:rPr>
         <w:t>Proof of Service</w:t>
       </w:r>
       <w:r>
@@ -5775,6 +6119,7 @@
         <w:rPr>
           <w:color w:val="222222"/>
         </w:rPr>
+        <w:lastRenderedPageBreak/>
         <w:t xml:space="preserve">{%p if </w:t>
       </w:r>
       <w:proofErr w:type="spellStart"/>
@@ -6107,7 +6452,6 @@
         <w:rPr>
           <w:color w:val="222222"/>
         </w:rPr>
-        <w:lastRenderedPageBreak/>
         <w:t xml:space="preserve">{%p </w:t>
       </w:r>
       <w:proofErr w:type="gramStart"/>
@@ -6688,6 +7032,7 @@
         <w:rPr>
           <w:color w:val="222222"/>
         </w:rPr>
+        <w:lastRenderedPageBreak/>
         <w:t>Pre-Trial Notice &amp;/or Notice of Taking Judgment (yellow form)</w:t>
       </w:r>
     </w:p>
@@ -6921,7 +7266,6 @@
         <w:rPr>
           <w:color w:val="222222"/>
         </w:rPr>
-        <w:lastRenderedPageBreak/>
         <w:t xml:space="preserve">Friend of the Court Handbook.  (Print a copy of this </w:t>
       </w:r>
       <w:hyperlink r:id="rId41" w:history="1">

</xml_diff>